<commit_message>
Remove the optional feedback section
Co-Authored-By: Claude Opus 5.5 <noreply@anthropic.com>
Claude-Session: https://claude.ai/code/session_015HDBYwejW7XLvPNhSrJNtf
</commit_message>
<xml_diff>
--- a/Onieal_HW6.docx
+++ b/Onieal_HW6.docx
@@ -27813,92 +27813,6 @@
     <w:bookmarkEnd w:id="96"/>
     <w:bookmarkEnd w:id="97"/>
     <w:bookmarkEnd w:id="98"/>
-    <w:bookmarkStart w:id="99" w:name="optional-feedback"/>
-    <w:p>
-      <w:pPr>
-        <w:pStyle w:val="Heading1"/>
-      </w:pPr>
-      <w:r>
-        <w:t xml:space="preserve">Optional Feedback</w:t>
-      </w:r>
-    </w:p>
-    <w:p>
-      <w:pPr>
-        <w:pStyle w:val="FirstParagraph"/>
-      </w:pPr>
-      <w:r>
-        <w:t xml:space="preserve">Have feedback for this assignment? Found something confusing? We’d love to hear from you!</w:t>
-      </w:r>
-    </w:p>
-    <w:p>
-      <w:pPr>
-        <w:pStyle w:val="AnswerText"/>
-      </w:pPr>
-      <w:r>
-        <w:t xml:space="preserve">A few things I ran into, in case they help for next time. Section 3.3 depends on OpenAI models that were shut down on September 28, 2026, so it can’t be done as written anymore. 3.2.6 says to copy</w:t>
-      </w:r>
-      <w:r>
-        <w:t xml:space="preserve"> </w:t>
-      </w:r>
-      <w:r>
-        <w:rPr>
-          <w:rStyle w:val="VerbatimChar"/>
-        </w:rPr>
-        <w:t xml:space="preserve">classification_base.py</w:t>
-      </w:r>
-      <w:r>
-        <w:t xml:space="preserve">, but the skeleton’s file is</w:t>
-      </w:r>
-      <w:r>
-        <w:t xml:space="preserve"> </w:t>
-      </w:r>
-      <w:r>
-        <w:rPr>
-          <w:rStyle w:val="VerbatimChar"/>
-        </w:rPr>
-        <w:t xml:space="preserve">base_classification.py</w:t>
-      </w:r>
-      <w:r>
-        <w:t xml:space="preserve">. In</w:t>
-      </w:r>
-      <w:r>
-        <w:t xml:space="preserve"> </w:t>
-      </w:r>
-      <w:r>
-        <w:rPr>
-          <w:rStyle w:val="VerbatimChar"/>
-        </w:rPr>
-        <w:t xml:space="preserve">classification.py</w:t>
-      </w:r>
-      <w:r>
-        <w:t xml:space="preserve">, the comments refer to</w:t>
-      </w:r>
-      <w:r>
-        <w:t xml:space="preserve"> </w:t>
-      </w:r>
-      <w:r>
-        <w:rPr>
-          <w:rStyle w:val="VerbatimChar"/>
-        </w:rPr>
-        <w:t xml:space="preserve">mymodel.head</w:t>
-      </w:r>
-      <w:r>
-        <w:t xml:space="preserve">, but the attribute is</w:t>
-      </w:r>
-      <w:r>
-        <w:t xml:space="preserve"> </w:t>
-      </w:r>
-      <w:r>
-        <w:rPr>
-          <w:rStyle w:val="VerbatimChar"/>
-        </w:rPr>
-        <w:t xml:space="preserve">mymodel.classifier</w:t>
-      </w:r>
-      <w:r>
-        <w:t xml:space="preserve">, and the learning-rate scheduler is attached to the full fine-tuning optimizer even in head and prefix mode, so those two never warm up or decay.</w:t>
-      </w:r>
-    </w:p>
-    <w:bookmarkEnd w:id="99"/>
     <w:sectPr>
       <w:footnotePr>
         <w:numRestart w:val="eachSect"/>

</xml_diff>

<commit_message>
3.3.1 console screenshot, drop BERT-large from 3.1.4
Co-Authored-By: Claude Opus 5.5 <noreply@anthropic.com>
Claude-Session: https://claude.ai/code/session_015HDBYwejW7XLvPNhSrJNtf
</commit_message>
<xml_diff>
--- a/Onieal_HW6.docx
+++ b/Onieal_HW6.docx
@@ -19004,7 +19004,7 @@
     </w:p>
     <w:bookmarkEnd w:id="29"/>
     <w:bookmarkEnd w:id="30"/>
-    <w:bookmarkStart w:id="98" w:name="programming"/>
+    <w:bookmarkStart w:id="101" w:name="programming"/>
     <w:p>
       <w:pPr>
         <w:pStyle w:val="Heading1"/>
@@ -20851,16 +20851,7 @@
         <w:t xml:space="preserve">base_classification.py</w:t>
       </w:r>
       <w:r>
-        <w:t xml:space="preserve">, seed, and data split. Each model’s bars are its best run on dev, and I only looked at test for that run. distilBERT from 3.1.3 is there for reference. BERT-large-uncased gets 0, because on my 6 GB GPU it ran out of memory at batch size 1 in float32 (</w:t>
-      </w:r>
-      <w:r>
-        <w:rPr>
-          <w:rStyle w:val="VerbatimChar"/>
-        </w:rPr>
-        <w:t xml:space="preserve">results/batch_probe_bert-large-uncased.json</w:t>
-      </w:r>
-      <w:r>
-        <w:t xml:space="preserve">).</w:t>
+        <w:t xml:space="preserve">, seed, and data split. Each model’s bars are its best run on dev, and I only looked at test for that run. distilBERT from 3.1.3 is there for reference.</w:t>
       </w:r>
     </w:p>
     <w:p>
@@ -20870,7 +20861,7 @@
       <w:r>
         <w:drawing>
           <wp:inline>
-            <wp:extent cx="5334000" cy="2461846"/>
+            <wp:extent cx="5334000" cy="2784737"/>
             <wp:effectExtent b="0" l="0" r="0" t="0"/>
             <wp:docPr descr="Best run per model, picked on dev (plots/3.1.4_model_comparison.png). The dashed line is always answering yes." title="" id="51" name="Picture"/>
             <a:graphic>
@@ -20891,7 +20882,7 @@
                   <pic:spPr bwMode="auto">
                     <a:xfrm>
                       <a:off x="0" y="0"/>
-                      <a:ext cx="5334000" cy="2461846"/>
+                      <a:ext cx="5334000" cy="2784737"/>
                     </a:xfrm>
                     <a:prstGeom prst="rect">
                       <a:avLst/>
@@ -21139,56 +21130,6 @@
             </w:pPr>
             <w:r>
               <w:t xml:space="preserve">0.6230</w:t>
-            </w:r>
-          </w:p>
-        </w:tc>
-      </w:tr>
-      <w:tr>
-        <w:tc>
-          <w:tcPr/>
-          <w:p>
-            <w:pPr>
-              <w:pStyle w:val="Compact"/>
-              <w:jc w:val="left"/>
-            </w:pPr>
-            <w:r>
-              <w:t xml:space="preserve">BERT-large-uncased</w:t>
-            </w:r>
-          </w:p>
-        </w:tc>
-        <w:tc>
-          <w:tcPr/>
-          <w:p>
-            <w:pPr>
-              <w:pStyle w:val="Compact"/>
-              <w:jc w:val="left"/>
-            </w:pPr>
-            <w:r>
-              <w:t xml:space="preserve">doesn’t fit on my GPU</w:t>
-            </w:r>
-          </w:p>
-        </w:tc>
-        <w:tc>
-          <w:tcPr/>
-          <w:p>
-            <w:pPr>
-              <w:pStyle w:val="Compact"/>
-              <w:jc w:val="right"/>
-            </w:pPr>
-            <w:r>
-              <w:t xml:space="preserve">0</w:t>
-            </w:r>
-          </w:p>
-        </w:tc>
-        <w:tc>
-          <w:tcPr/>
-          <w:p>
-            <w:pPr>
-              <w:pStyle w:val="Compact"/>
-              <w:jc w:val="right"/>
-            </w:pPr>
-            <w:r>
-              <w:t xml:space="preserve">0</w:t>
             </w:r>
           </w:p>
         </w:tc>
@@ -21765,7 +21706,7 @@
         <w:t xml:space="preserve">--amp</w:t>
       </w:r>
       <w:r>
-        <w:t xml:space="preserve">. It scored 0.7208 on dev and 0.7085 on test, against 0.7141 and 0.7057 in float32, and ran in 6.7 minutes instead of 9.2. That’s within 0.7 points, so bfloat16 isn’t what separates the models here. BERT-large would fit on the L4’s 24 GB, but I didn’t run it there. On my own machine it doesn’t fit, which is the case the question describes.</w:t>
+        <w:t xml:space="preserve">. It scored 0.7208 on dev and 0.7085 on test, against 0.7141 and 0.7057 in float32, and ran in 6.7 minutes instead of 9.2. That’s within 0.7 points, so bfloat16 isn’t what separates the models here.</w:t>
       </w:r>
     </w:p>
     <w:p>
@@ -25847,7 +25788,7 @@
       </w:r>
     </w:p>
     <w:bookmarkEnd w:id="81"/>
-    <w:bookmarkStart w:id="97" w:name="in-context-learning"/>
+    <w:bookmarkStart w:id="100" w:name="in-context-learning"/>
     <w:p>
       <w:pPr>
         <w:pStyle w:val="Heading2"/>
@@ -26080,7 +26021,7 @@
         <w:t xml:space="preserve">. Later we’ll see how to integrate it directly into our code.</w:t>
       </w:r>
     </w:p>
-    <w:bookmarkStart w:id="96" w:name="openai"/>
+    <w:bookmarkStart w:id="99" w:name="openai"/>
     <w:p>
       <w:pPr>
         <w:pStyle w:val="Heading4"/>
@@ -26341,7 +26282,7 @@
         <w:pStyle w:val="AnswerText"/>
       </w:pPr>
       <w:r>
-        <w:t xml:space="preserve">The Playground no longer exists, so there’s no screenshot to paste. This is the completion as text, from</w:t>
+        <w:t xml:space="preserve">The Playground no longer exists, so this is a screenshot of the console output from</w:t>
       </w:r>
       <w:r>
         <w:t xml:space="preserve"> </w:t>
@@ -26353,7 +26294,10 @@
         <w:t xml:space="preserve">hw6/playground_prompts_local.py</w:t>
       </w:r>
       <w:r>
-        <w:t xml:space="preserve">. The full output is in</w:t>
+        <w:t xml:space="preserve"> </w:t>
+      </w:r>
+      <w:r>
+        <w:t xml:space="preserve">instead. The same text is in</w:t>
       </w:r>
       <w:r>
         <w:t xml:space="preserve"> </w:t>
@@ -26380,7 +26324,7 @@
         <w:t xml:space="preserve">hw6/playground_prompts_local.json</w:t>
       </w:r>
       <w:r>
-        <w:t xml:space="preserve">. The prompt is exactly as given, decoding is greedy (temperature 0), and the limit is 80 new tokens, with a stop at a blank line. Qwen2.5-1.5B-Instruct, standing in for</w:t>
+        <w:t xml:space="preserve">. The prompt is exactly as given, decoding is greedy (temperature 0), and the limit is 80 new tokens, with a stop at a blank line. The answer is the middle block, from Qwen2.5-1.5B-Instruct, standing in for</w:t>
       </w:r>
       <w:r>
         <w:t xml:space="preserve"> </w:t>
@@ -26392,27 +26336,89 @@
         <w:t xml:space="preserve">gpt-3.5-turbo-instruct</w:t>
       </w:r>
       <w:r>
-        <w:t xml:space="preserve">, continued it like this (the prompt, then the completion):</w:t>
+        <w:t xml:space="preserve">. In each block,</w:t>
+      </w:r>
+      <w:r>
+        <w:t xml:space="preserve"> </w:t>
+      </w:r>
+      <w:r>
+        <w:t xml:space="preserve">“</w:t>
+      </w:r>
+      <w:r>
+        <w:t xml:space="preserve">[prompt]</w:t>
+      </w:r>
+      <w:r>
+        <w:t xml:space="preserve">”</w:t>
+      </w:r>
+      <w:r>
+        <w:t xml:space="preserve"> </w:t>
+      </w:r>
+      <w:r>
+        <w:t xml:space="preserve">stands for the prompt, and the text after it is the completion. The first block is the base model and the last is the same prompt as a chat turn, both discussed below.</w:t>
       </w:r>
     </w:p>
     <w:p>
       <w:pPr>
-        <w:pStyle w:val="SourceCode"/>
-      </w:pPr>
+        <w:pStyle w:val="CaptionedFigure"/>
+      </w:pPr>
+      <w:r>
+        <w:drawing>
+          <wp:inline>
+            <wp:extent cx="5334000" cy="2368378"/>
+            <wp:effectExtent b="0" l="0" r="0" t="0"/>
+            <wp:docPr descr="Console output for 3.3.1 (plots/3.3.1_terminal.png)." title="" id="92" name="Picture"/>
+            <a:graphic>
+              <a:graphicData uri="http://schemas.openxmlformats.org/drawingml/2006/picture">
+                <pic:pic>
+                  <pic:nvPicPr>
+                    <pic:cNvPr descr="plots/3.3.1_terminal.png" id="93" name="Picture"/>
+                    <pic:cNvPicPr>
+                      <a:picLocks noChangeArrowheads="1" noChangeAspect="1"/>
+                    </pic:cNvPicPr>
+                  </pic:nvPicPr>
+                  <pic:blipFill>
+                    <a:blip r:embed="rId91"/>
+                    <a:stretch>
+                      <a:fillRect/>
+                    </a:stretch>
+                  </pic:blipFill>
+                  <pic:spPr bwMode="auto">
+                    <a:xfrm>
+                      <a:off x="0" y="0"/>
+                      <a:ext cx="5334000" cy="2368378"/>
+                    </a:xfrm>
+                    <a:prstGeom prst="rect">
+                      <a:avLst/>
+                    </a:prstGeom>
+                    <a:noFill/>
+                    <a:ln w="9525">
+                      <a:noFill/>
+                      <a:headEnd/>
+                      <a:tailEnd/>
+                    </a:ln>
+                  </pic:spPr>
+                </pic:pic>
+              </a:graphicData>
+            </a:graphic>
+          </wp:inline>
+        </w:drawing>
+      </w:r>
+    </w:p>
+    <w:p>
+      <w:pPr>
+        <w:pStyle w:val="ImageCaption"/>
+      </w:pPr>
+      <w:r>
+        <w:t xml:space="preserve">Console output for 3.3.1 (</w:t>
+      </w:r>
       <w:r>
         <w:rPr>
           <w:rStyle w:val="VerbatimChar"/>
         </w:rPr>
-        <w:t xml:space="preserve">Trevor Adriaanse's course on "self-supervised model" at Johns Hopkins is a great example of how to use the power of self-supervised learning for image classification. The goal of this project was to classify images into 10 different categories, using only unlabeled data.</w:t>
-      </w:r>
-      <w:r>
-        <w:br/>
-      </w:r>
-      <w:r>
-        <w:rPr>
-          <w:rStyle w:val="VerbatimChar"/>
-        </w:rPr>
-        <w:t xml:space="preserve">The dataset used in this project consists of 256x256 RGB images from the CIFAR-10 dataset. Each image has been randomly cropped and resized to fit within a square region of size</w:t>
+        <w:t xml:space="preserve">plots/3.3.1_terminal.png</w:t>
+      </w:r>
+      <w:r>
+        <w:t xml:space="preserve">).</w:t>
       </w:r>
     </w:p>
     <w:p>
@@ -26521,882 +26527,6 @@
       </w:r>
       <w:r>
         <w:t xml:space="preserve">GPT models come in several different sizes and capabilities. You can read more documentation on these models</w:t>
-      </w:r>
-      <w:r>
-        <w:t xml:space="preserve"> </w:t>
-      </w:r>
-      <w:hyperlink r:id="rId91">
-        <w:r>
-          <w:rPr>
-            <w:rStyle w:val="Hyperlink"/>
-          </w:rPr>
-          <w:t xml:space="preserve">here</w:t>
-        </w:r>
-      </w:hyperlink>
-      <w:r>
-        <w:t xml:space="preserve">. For our homework, we use the</w:t>
-      </w:r>
-      <w:r>
-        <w:t xml:space="preserve"> </w:t>
-      </w:r>
-      <w:r>
-        <w:rPr>
-          <w:rStyle w:val="VerbatimChar"/>
-        </w:rPr>
-        <w:t xml:space="preserve">gpt-3.5-turbo-instruct</w:t>
-      </w:r>
-      <w:r>
-        <w:t xml:space="preserve"> </w:t>
-      </w:r>
-      <w:r>
-        <w:t xml:space="preserve">model.</w:t>
-      </w:r>
-    </w:p>
-    <w:p>
-      <w:pPr>
-        <w:numPr>
-          <w:ilvl w:val="1"/>
-          <w:numId w:val="1038"/>
-        </w:numPr>
-      </w:pPr>
-      <w:r>
-        <w:rPr>
-          <w:bCs/>
-          <w:b/>
-        </w:rPr>
-        <w:t xml:space="preserve">Temperature and Top P sampling:</w:t>
-      </w:r>
-      <w:r>
-        <w:t xml:space="preserve"> </w:t>
-      </w:r>
-      <w:r>
-        <w:t xml:space="preserve">control how the model samples tokens from its distribution. Setting Temperature to 0 will cause the model to produce the highest probability output. Setting it closer to 1 will increase its propensity to create more diverse output.</w:t>
-      </w:r>
-    </w:p>
-    <w:p>
-      <w:pPr>
-        <w:numPr>
-          <w:ilvl w:val="1"/>
-          <w:numId w:val="1038"/>
-        </w:numPr>
-      </w:pPr>
-      <w:r>
-        <w:rPr>
-          <w:bCs/>
-          <w:b/>
-        </w:rPr>
-        <w:t xml:space="preserve">Maximum length:</w:t>
-      </w:r>
-      <w:r>
-        <w:t xml:space="preserve"> </w:t>
-      </w:r>
-      <w:r>
-        <w:t xml:space="preserve">what’s the maximum length (in tokens) that the model will output?</w:t>
-      </w:r>
-    </w:p>
-    <w:p>
-      <w:pPr>
-        <w:numPr>
-          <w:ilvl w:val="1"/>
-          <w:numId w:val="1038"/>
-        </w:numPr>
-      </w:pPr>
-      <w:r>
-        <w:rPr>
-          <w:bCs/>
-          <w:b/>
-        </w:rPr>
-        <w:t xml:space="preserve">Stop sequences:</w:t>
-      </w:r>
-      <w:r>
-        <w:t xml:space="preserve"> </w:t>
-      </w:r>
-      <w:r>
-        <w:t xml:space="preserve">you can specify what tokens should cause the model to stop generating. You can use the newline character or any special sequence that you designate.</w:t>
-      </w:r>
-    </w:p>
-    <w:p>
-      <w:pPr>
-        <w:numPr>
-          <w:ilvl w:val="1"/>
-          <w:numId w:val="1038"/>
-        </w:numPr>
-      </w:pPr>
-      <w:r>
-        <w:rPr>
-          <w:bCs/>
-          <w:b/>
-        </w:rPr>
-        <w:t xml:space="preserve">Frequency Penalty and Presence Penalty:</w:t>
-      </w:r>
-      <w:r>
-        <w:t xml:space="preserve"> </w:t>
-      </w:r>
-      <w:r>
-        <w:t xml:space="preserve">two parameters that help to limit how much repetition there is in the model’s output.</w:t>
-      </w:r>
-    </w:p>
-    <w:p>
-      <w:pPr>
-        <w:numPr>
-          <w:ilvl w:val="1"/>
-          <w:numId w:val="1038"/>
-        </w:numPr>
-      </w:pPr>
-      <w:r>
-        <w:rPr>
-          <w:bCs/>
-          <w:b/>
-        </w:rPr>
-        <w:t xml:space="preserve">Best of:</w:t>
-      </w:r>
-      <w:r>
-        <w:t xml:space="preserve"> </w:t>
-      </w:r>
-      <w:r>
-        <w:t xml:space="preserve">Best of</w:t>
-      </w:r>
-      <w:r>
-        <w:t xml:space="preserve"> </w:t>
-      </w:r>
-      <m:oMath>
-        <m:r>
-          <m:t>n</m:t>
-        </m:r>
-      </m:oMath>
-      <w:r>
-        <w:t xml:space="preserve"> </w:t>
-      </w:r>
-      <w:r>
-        <w:t xml:space="preserve">indicates the model generate</w:t>
-      </w:r>
-      <w:r>
-        <w:t xml:space="preserve"> </w:t>
-      </w:r>
-      <m:oMath>
-        <m:r>
-          <m:t>n</m:t>
-        </m:r>
-      </m:oMath>
-      <w:r>
-        <w:t xml:space="preserve"> </w:t>
-      </w:r>
-      <w:r>
-        <w:t xml:space="preserve">completion candidates on the server side, and display the top-1 on the client (user) side.</w:t>
-      </w:r>
-    </w:p>
-    <w:p>
-      <w:pPr>
-        <w:numPr>
-          <w:ilvl w:val="0"/>
-          <w:numId w:val="1039"/>
-        </w:numPr>
-      </w:pPr>
-      <w:r>
-        <w:t xml:space="preserve">For the remaining parts of this section, set the engine to</w:t>
-      </w:r>
-      <w:r>
-        <w:t xml:space="preserve"> </w:t>
-      </w:r>
-      <w:r>
-        <w:rPr>
-          <w:rStyle w:val="VerbatimChar"/>
-        </w:rPr>
-        <w:t xml:space="preserve">davinci</w:t>
-      </w:r>
-      <w:r>
-        <w:t xml:space="preserve"> </w:t>
-      </w:r>
-      <w:r>
-        <w:t xml:space="preserve">so that it uses vanilla language model (no additional tuning with human feedback).</w:t>
-      </w:r>
-      <w:r>
-        <w:br/>
-      </w:r>
-      <w:r>
-        <w:rPr>
-          <w:bCs/>
-          <w:b/>
-        </w:rPr>
-        <w:t xml:space="preserve">In-context learning:</w:t>
-      </w:r>
-      <w:r>
-        <w:t xml:space="preserve"> </w:t>
-      </w:r>
-      <w:r>
-        <w:t xml:space="preserve">In addition to writing awesome reviews of your professors, you can design prompts to get GPT-3 to do all sorts of surprising things. For instance, GPT-3 can perform few-shot learning. Given a few examples of a task, it can learn a pattern very quickly and then be used for classification tasks. It often helps to tell the model what you want it to do.</w:t>
-      </w:r>
-    </w:p>
-    <w:p>
-      <w:pPr>
-        <w:numPr>
-          <w:ilvl w:val="0"/>
-          <w:numId w:val="1000"/>
-        </w:numPr>
-      </w:pPr>
-      <w:r>
-        <w:t xml:space="preserve">Here’s an example from the paper that introduced GPT-3. It shows a few-show learning example for correcting grammatically incorrect English sentences.</w:t>
-      </w:r>
-    </w:p>
-    <w:p>
-      <w:pPr>
-        <w:numPr>
-          <w:ilvl w:val="0"/>
-          <w:numId w:val="1000"/>
-        </w:numPr>
-        <w:pStyle w:val="SourceCode"/>
-      </w:pPr>
-      <w:r>
-        <w:rPr>
-          <w:rStyle w:val="VerbatimChar"/>
-        </w:rPr>
-        <w:t xml:space="preserve">Poor English input:  I eated the purple berries.</w:t>
-      </w:r>
-      <w:r>
-        <w:br/>
-      </w:r>
-      <w:r>
-        <w:rPr>
-          <w:rStyle w:val="VerbatimChar"/>
-        </w:rPr>
-        <w:t xml:space="preserve">Good English output:  I ate the purple berries.</w:t>
-      </w:r>
-      <w:r>
-        <w:br/>
-      </w:r>
-      <w:r>
-        <w:br/>
-      </w:r>
-      <w:r>
-        <w:rPr>
-          <w:rStyle w:val="VerbatimChar"/>
-        </w:rPr>
-        <w:t xml:space="preserve">Poor English input:  Thank you for picking me as your designer.  I'd appreciate it.</w:t>
-      </w:r>
-      <w:r>
-        <w:br/>
-      </w:r>
-      <w:r>
-        <w:rPr>
-          <w:rStyle w:val="VerbatimChar"/>
-        </w:rPr>
-        <w:t xml:space="preserve">Good English output:  Thank you for choosing me as your designer.  I appreciate it.</w:t>
-      </w:r>
-      <w:r>
-        <w:br/>
-      </w:r>
-      <w:r>
-        <w:br/>
-      </w:r>
-      <w:r>
-        <w:rPr>
-          <w:rStyle w:val="VerbatimChar"/>
-        </w:rPr>
-        <w:t xml:space="preserve">Poor English input:  The mentioned changes have done.  or I did the alteration that you requested.  or I changed things you wanted and did the modifications.</w:t>
-      </w:r>
-      <w:r>
-        <w:br/>
-      </w:r>
-      <w:r>
-        <w:rPr>
-          <w:rStyle w:val="VerbatimChar"/>
-        </w:rPr>
-        <w:t xml:space="preserve">Good English output:  The requested changes have been made.  or I made the alteration that you requested.  or I changed things you wanted and made the modifications.</w:t>
-      </w:r>
-      <w:r>
-        <w:br/>
-      </w:r>
-      <w:r>
-        <w:br/>
-      </w:r>
-      <w:r>
-        <w:rPr>
-          <w:rStyle w:val="VerbatimChar"/>
-        </w:rPr>
-        <w:t xml:space="preserve">Poor English input:  I'd be more than happy to work with you in another project.</w:t>
-      </w:r>
-    </w:p>
-    <w:p>
-      <w:pPr>
-        <w:numPr>
-          <w:ilvl w:val="0"/>
-          <w:numId w:val="1000"/>
-        </w:numPr>
-      </w:pPr>
-      <w:r>
-        <w:rPr>
-          <w:bCs/>
-          <w:b/>
-        </w:rPr>
-        <w:t xml:space="preserve">TODOs</w:t>
-      </w:r>
-      <w:r>
-        <w:t xml:space="preserve">: Paste this prompt into the playground, press the</w:t>
-      </w:r>
-      <w:r>
-        <w:t xml:space="preserve"> </w:t>
-      </w:r>
-      <w:r>
-        <w:t xml:space="preserve">“</w:t>
-      </w:r>
-      <w:r>
-        <w:t xml:space="preserve">Generate</w:t>
-      </w:r>
-      <w:r>
-        <w:t xml:space="preserve">”</w:t>
-      </w:r>
-      <w:r>
-        <w:t xml:space="preserve"> </w:t>
-      </w:r>
-      <w:r>
-        <w:t xml:space="preserve">button, and see what it says. Paste the completion below:</w:t>
-      </w:r>
-    </w:p>
-    <w:p>
-      <w:pPr>
-        <w:pStyle w:val="AnswerText"/>
-      </w:pPr>
-      <w:r>
-        <w:t xml:space="preserve">The base model, Qwen2.5-1.5B, standing in for</w:t>
-      </w:r>
-      <w:r>
-        <w:t xml:space="preserve"> </w:t>
-      </w:r>
-      <w:r>
-        <w:rPr>
-          <w:rStyle w:val="VerbatimChar"/>
-        </w:rPr>
-        <w:t xml:space="preserve">davinci</w:t>
-      </w:r>
-      <w:r>
-        <w:t xml:space="preserve">, completed it like this (greedy, up to 40 new tokens, with a stop at a blank line):</w:t>
-      </w:r>
-    </w:p>
-    <w:p>
-      <w:pPr>
-        <w:pStyle w:val="SourceCode"/>
-      </w:pPr>
-      <w:r>
-        <w:rPr>
-          <w:rStyle w:val="VerbatimChar"/>
-        </w:rPr>
-        <w:t xml:space="preserve">Good English output:  I would be more than happy to work with you in another project.</w:t>
-      </w:r>
-    </w:p>
-    <w:p>
-      <w:pPr>
-        <w:pStyle w:val="AnswerText"/>
-      </w:pPr>
-      <w:r>
-        <w:t xml:space="preserve">It picked up the format from the three examples, including the label and the two spaces after the colon, and it stopped at the blank line where the next example would start. But the fix misses the actual error. It expanded</w:t>
-      </w:r>
-      <w:r>
-        <w:t xml:space="preserve"> </w:t>
-      </w:r>
-      <w:r>
-        <w:t xml:space="preserve">“</w:t>
-      </w:r>
-      <w:r>
-        <w:t xml:space="preserve">I’d</w:t>
-      </w:r>
-      <w:r>
-        <w:t xml:space="preserve">”</w:t>
-      </w:r>
-      <w:r>
-        <w:t xml:space="preserve"> </w:t>
-      </w:r>
-      <w:r>
-        <w:t xml:space="preserve">to</w:t>
-      </w:r>
-      <w:r>
-        <w:t xml:space="preserve"> </w:t>
-      </w:r>
-      <w:r>
-        <w:t xml:space="preserve">“</w:t>
-      </w:r>
-      <w:r>
-        <w:t xml:space="preserve">I would</w:t>
-      </w:r>
-      <w:r>
-        <w:t xml:space="preserve">”</w:t>
-      </w:r>
-      <w:r>
-        <w:t xml:space="preserve"> </w:t>
-      </w:r>
-      <w:r>
-        <w:t xml:space="preserve">and kept</w:t>
-      </w:r>
-      <w:r>
-        <w:t xml:space="preserve"> </w:t>
-      </w:r>
-      <w:r>
-        <w:t xml:space="preserve">“</w:t>
-      </w:r>
-      <w:r>
-        <w:t xml:space="preserve">in another project,</w:t>
-      </w:r>
-      <w:r>
-        <w:t xml:space="preserve">”</w:t>
-      </w:r>
-      <w:r>
-        <w:t xml:space="preserve"> </w:t>
-      </w:r>
-      <w:r>
-        <w:t xml:space="preserve">where the preposition should be</w:t>
-      </w:r>
-      <w:r>
-        <w:t xml:space="preserve"> </w:t>
-      </w:r>
-      <w:r>
-        <w:t xml:space="preserve">“</w:t>
-      </w:r>
-      <w:r>
-        <w:t xml:space="preserve">on.</w:t>
-      </w:r>
-      <w:r>
-        <w:t xml:space="preserve">”</w:t>
-      </w:r>
-      <w:r>
-        <w:t xml:space="preserve"> </w:t>
-      </w:r>
-      <w:r>
-        <w:t xml:space="preserve">The Instruct model, given the same raw prompt, made the real fix:</w:t>
-      </w:r>
-      <w:r>
-        <w:t xml:space="preserve"> </w:t>
-      </w:r>
-      <w:r>
-        <w:t xml:space="preserve">“</w:t>
-      </w:r>
-      <w:r>
-        <w:t xml:space="preserve">I would be more than happy to work with you on another project.</w:t>
-      </w:r>
-      <w:r>
-        <w:t xml:space="preserve">”</w:t>
-      </w:r>
-      <w:r>
-        <w:t xml:space="preserve"> </w:t>
-      </w:r>
-      <w:r>
-        <w:t xml:space="preserve">So did the Instruct model as a chat turn. Three examples were enough for the base model to learn the shape of the task. Getting the correction itself right is where the instruction tuning showed.</w:t>
-      </w:r>
-    </w:p>
-    <w:p>
-      <w:pPr>
-        <w:numPr>
-          <w:ilvl w:val="0"/>
-          <w:numId w:val="1040"/>
-        </w:numPr>
-        <w:pStyle w:val="Compact"/>
-      </w:pPr>
-      <w:r>
-        <w:rPr>
-          <w:bCs/>
-          <w:b/>
-        </w:rPr>
-        <w:t xml:space="preserve">Instruction following:</w:t>
-      </w:r>
-      <w:r>
-        <w:t xml:space="preserve"> </w:t>
-      </w:r>
-      <w:r>
-        <w:t xml:space="preserve">In addition to few shot learning, GPT and other large language models do a pretty remarkable job in</w:t>
-      </w:r>
-      <w:r>
-        <w:t xml:space="preserve"> </w:t>
-      </w:r>
-      <w:r>
-        <w:t xml:space="preserve">“</w:t>
-      </w:r>
-      <w:r>
-        <w:t xml:space="preserve">zero-shot</w:t>
-      </w:r>
-      <w:r>
-        <w:t xml:space="preserve">”</w:t>
-      </w:r>
-      <w:r>
-        <w:t xml:space="preserve"> </w:t>
-      </w:r>
-      <w:r>
-        <w:t xml:space="preserve">scenarios. You can give them instructions in natural language and they may produce remarkably good output.</w:t>
-      </w:r>
-    </w:p>
-    <w:p>
-      <w:pPr>
-        <w:numPr>
-          <w:ilvl w:val="0"/>
-          <w:numId w:val="1041"/>
-        </w:numPr>
-      </w:pPr>
-      <w:r>
-        <w:t xml:space="preserve">For example, let’s try the following prompt:</w:t>
-      </w:r>
-    </w:p>
-    <w:p>
-      <w:pPr>
-        <w:numPr>
-          <w:ilvl w:val="0"/>
-          <w:numId w:val="1000"/>
-        </w:numPr>
-        <w:pStyle w:val="SourceCode"/>
-      </w:pPr>
-      <w:r>
-        <w:rPr>
-          <w:rStyle w:val="VerbatimChar"/>
-        </w:rPr>
-        <w:t xml:space="preserve">Correct this English text:  Today I have went to the store to to buys some many bottle of water.</w:t>
-      </w:r>
-    </w:p>
-    <w:p>
-      <w:pPr>
-        <w:numPr>
-          <w:ilvl w:val="0"/>
-          <w:numId w:val="1000"/>
-        </w:numPr>
-      </w:pPr>
-      <w:r>
-        <w:rPr>
-          <w:bCs/>
-          <w:b/>
-        </w:rPr>
-        <w:t xml:space="preserve">TODOs</w:t>
-      </w:r>
-      <w:r>
-        <w:t xml:space="preserve">: Paste this prompt into the playground, press the</w:t>
-      </w:r>
-      <w:r>
-        <w:t xml:space="preserve"> </w:t>
-      </w:r>
-      <w:r>
-        <w:t xml:space="preserve">“</w:t>
-      </w:r>
-      <w:r>
-        <w:t xml:space="preserve">Generate</w:t>
-      </w:r>
-      <w:r>
-        <w:t xml:space="preserve">”</w:t>
-      </w:r>
-      <w:r>
-        <w:t xml:space="preserve"> </w:t>
-      </w:r>
-      <w:r>
-        <w:t xml:space="preserve">button, and see what it says. Paste the completion below:</w:t>
-      </w:r>
-    </w:p>
-    <w:p>
-      <w:pPr>
-        <w:pStyle w:val="AnswerText"/>
-      </w:pPr>
-      <w:r>
-        <w:t xml:space="preserve">The base model, Qwen2.5-1.5B, completed it like this (greedy, up to 60 new tokens, the prompt and then the completion):</w:t>
-      </w:r>
-    </w:p>
-    <w:p>
-      <w:pPr>
-        <w:pStyle w:val="SourceCode"/>
-      </w:pPr>
-      <w:r>
-        <w:rPr>
-          <w:rStyle w:val="VerbatimChar"/>
-        </w:rPr>
-        <w:t xml:space="preserve">Correct this English text:  Today I have went to the store to to buys some many bottle of water. I have bought 10 bottles of water and 5 bottles of juice. I have paid 10 dollars for the water and 5 dollars for the juice. I have got 15 dollars back from the store. I have went to the store to buy some many bottle of water.</w:t>
-      </w:r>
-    </w:p>
-    <w:p>
-      <w:pPr>
-        <w:pStyle w:val="AnswerText"/>
-      </w:pPr>
-      <w:r>
-        <w:t xml:space="preserve">It didn’t correct anything. It treated the instruction as the first line of a story and kept writing about bottles of water, and its last sentence repeats the original errors. A base model is only trained to predict the next token, and nothing in that training marks</w:t>
-      </w:r>
-      <w:r>
-        <w:t xml:space="preserve"> </w:t>
-      </w:r>
-      <w:r>
-        <w:t xml:space="preserve">“</w:t>
-      </w:r>
-      <w:r>
-        <w:t xml:space="preserve">Correct this English text:</w:t>
-      </w:r>
-      <w:r>
-        <w:t xml:space="preserve">”</w:t>
-      </w:r>
-      <w:r>
-        <w:t xml:space="preserve"> </w:t>
-      </w:r>
-      <w:r>
-        <w:t xml:space="preserve">as a command.</w:t>
-      </w:r>
-    </w:p>
-    <w:p>
-      <w:pPr>
-        <w:pStyle w:val="AnswerText"/>
-      </w:pPr>
-      <w:r>
-        <w:t xml:space="preserve">The Instruct model did no better as raw text. It continued the story too:</w:t>
-      </w:r>
-      <w:r>
-        <w:t xml:space="preserve"> </w:t>
-      </w:r>
-      <w:r>
-        <w:t xml:space="preserve">“</w:t>
-      </w:r>
-      <w:r>
-        <w:t xml:space="preserve">The price was very high, so I decided not to buy any.</w:t>
-      </w:r>
-      <w:r>
-        <w:t xml:space="preserve">”</w:t>
-      </w:r>
-      <w:r>
-        <w:t xml:space="preserve"> </w:t>
-      </w:r>
-      <w:r>
-        <w:t xml:space="preserve">Its instruction tuning only kicked in when the prompt came as a chat turn, through its chat template. Then it answered</w:t>
-      </w:r>
-      <w:r>
-        <w:t xml:space="preserve"> </w:t>
-      </w:r>
-      <w:r>
-        <w:t xml:space="preserve">“</w:t>
-      </w:r>
-      <w:r>
-        <w:t xml:space="preserve">Today, I went to the store to buy several bottles of water.</w:t>
-      </w:r>
-      <w:r>
-        <w:t xml:space="preserve">”</w:t>
-      </w:r>
-      <w:r>
-        <w:t xml:space="preserve"> </w:t>
-      </w:r>
-      <w:r>
-        <w:t xml:space="preserve">That fixes every error and keeps the meaning, though</w:t>
-      </w:r>
-      <w:r>
-        <w:t xml:space="preserve"> </w:t>
-      </w:r>
-      <w:r>
-        <w:t xml:space="preserve">“</w:t>
-      </w:r>
-      <w:r>
-        <w:t xml:space="preserve">several</w:t>
-      </w:r>
-      <w:r>
-        <w:t xml:space="preserve">”</w:t>
-      </w:r>
-      <w:r>
-        <w:t xml:space="preserve"> </w:t>
-      </w:r>
-      <w:r>
-        <w:t xml:space="preserve">is its guess at what</w:t>
-      </w:r>
-      <w:r>
-        <w:t xml:space="preserve"> </w:t>
-      </w:r>
-      <w:r>
-        <w:t xml:space="preserve">“</w:t>
-      </w:r>
-      <w:r>
-        <w:t xml:space="preserve">some many</w:t>
-      </w:r>
-      <w:r>
-        <w:t xml:space="preserve">”</w:t>
-      </w:r>
-      <w:r>
-        <w:t xml:space="preserve"> </w:t>
-      </w:r>
-      <w:r>
-        <w:t xml:space="preserve">meant. So the model can follow the instruction, but only in the format it was tuned on.</w:t>
-      </w:r>
-    </w:p>
-    <w:p>
-      <w:pPr>
-        <w:numPr>
-          <w:ilvl w:val="0"/>
-          <w:numId w:val="1042"/>
-        </w:numPr>
-      </w:pPr>
-      <w:r>
-        <w:rPr>
-          <w:bCs/>
-          <w:b/>
-        </w:rPr>
-        <w:t xml:space="preserve">Programmatic access:</w:t>
-      </w:r>
-      <w:r>
-        <w:t xml:space="preserve"> </w:t>
-      </w:r>
-      <w:r>
-        <w:t xml:space="preserve">In addition to prompting GPT models in the playground, you can write Python code to query models with provided OpenAI APIs. Now let’s use few-shot prompting to solve a few instance of BoolQ.</w:t>
-      </w:r>
-      <w:r>
-        <w:br/>
-      </w:r>
-      <w:r>
-        <w:rPr>
-          <w:bCs/>
-          <w:b/>
-        </w:rPr>
-        <w:t xml:space="preserve">TODOs</w:t>
-      </w:r>
-      <w:r>
-        <w:t xml:space="preserve">: Write a Python script for few-shot prompting OpenAI GPT models on BoolQ. Specifically, form a prompt by randomly selecting 8 demonstrations from BoolQ. Make sure to have a balanced prompt (50% ’yes’s and the rest ’no’s) and interleave them to prevent the recency and label-imbalance biases. Using this in-context demonstration, evaluate</w:t>
-      </w:r>
-      <w:r>
-        <w:t xml:space="preserve"> </w:t>
-      </w:r>
-      <w:r>
-        <w:rPr>
-          <w:rStyle w:val="VerbatimChar"/>
-        </w:rPr>
-        <w:t xml:space="preserve">gpt-3.5-turbo-instruct</w:t>
-      </w:r>
-      <w:r>
-        <w:t xml:space="preserve"> </w:t>
-      </w:r>
-      <w:r>
-        <w:t xml:space="preserve">on a small subset of BoolQ instances (say, 30 examples). Hand in your code used to perform this evaluation, it should be named as</w:t>
-      </w:r>
-      <w:r>
-        <w:t xml:space="preserve"> </w:t>
-      </w:r>
-      <w:r>
-        <w:rPr>
-          <w:rStyle w:val="VerbatimChar"/>
-        </w:rPr>
-        <w:t xml:space="preserve">openai_gpt-boolq.py</w:t>
-      </w:r>
-      <w:r>
-        <w:t xml:space="preserve">. Write down the evaluation accuracy below.</w:t>
-      </w:r>
-      <w:r>
-        <w:br/>
-      </w:r>
-      <w:r>
-        <w:rPr>
-          <w:bCs/>
-          <w:b/>
-        </w:rPr>
-        <w:t xml:space="preserve">Hints</w:t>
-      </w:r>
-      <w:r>
-        <w:t xml:space="preserve">:</w:t>
-      </w:r>
-    </w:p>
-    <w:p>
-      <w:pPr>
-        <w:numPr>
-          <w:ilvl w:val="1"/>
-          <w:numId w:val="1043"/>
-        </w:numPr>
-      </w:pPr>
-      <w:r>
-        <w:t xml:space="preserve">We use the</w:t>
-      </w:r>
-      <w:r>
-        <w:t xml:space="preserve"> </w:t>
-      </w:r>
-      <w:r>
-        <w:rPr>
-          <w:rStyle w:val="VerbatimChar"/>
-        </w:rPr>
-        <w:t xml:space="preserve">gpt-3.5-turbo-instruct</w:t>
-      </w:r>
-      <w:r>
-        <w:t xml:space="preserve"> </w:t>
-      </w:r>
-      <w:r>
-        <w:t xml:space="preserve">model (</w:t>
-      </w:r>
-      <w:r>
-        <w:rPr>
-          <w:rStyle w:val="VerbatimChar"/>
-        </w:rPr>
-        <w:t xml:space="preserve">model="gpt-3.5-turbo-instruct"</w:t>
-      </w:r>
-      <w:r>
-        <w:t xml:space="preserve">)</w:t>
-      </w:r>
-    </w:p>
-    <w:p>
-      <w:pPr>
-        <w:numPr>
-          <w:ilvl w:val="1"/>
-          <w:numId w:val="1043"/>
-        </w:numPr>
-      </w:pPr>
-      <w:r>
-        <w:t xml:space="preserve">You can use the playground to create a skeleton code to start with based on a prompt that you can then use in your Python projects. Click on the</w:t>
-      </w:r>
-      <w:r>
-        <w:t xml:space="preserve"> </w:t>
-      </w:r>
-      <w:r>
-        <w:t xml:space="preserve">“</w:t>
-      </w:r>
-      <w:r>
-        <w:t xml:space="preserve">View Code</w:t>
-      </w:r>
-      <w:r>
-        <w:t xml:space="preserve">”</w:t>
-      </w:r>
-      <w:r>
-        <w:t xml:space="preserve"> </w:t>
-      </w:r>
-      <w:r>
-        <w:t xml:space="preserve">button on the top-right, and you’ll get some code that you can convert into a script.</w:t>
-      </w:r>
-    </w:p>
-    <w:p>
-      <w:pPr>
-        <w:numPr>
-          <w:ilvl w:val="1"/>
-          <w:numId w:val="1043"/>
-        </w:numPr>
-      </w:pPr>
-      <w:r>
-        <w:t xml:space="preserve">You can also refer to the full documentation for</w:t>
-      </w:r>
-      <w:r>
-        <w:t xml:space="preserve"> </w:t>
-      </w:r>
-      <w:hyperlink r:id="rId92">
-        <w:r>
-          <w:rPr>
-            <w:rStyle w:val="Hyperlink"/>
-          </w:rPr>
-          <w:t xml:space="preserve">creating completion</w:t>
-        </w:r>
-      </w:hyperlink>
-      <w:r>
-        <w:t xml:space="preserve"> </w:t>
-      </w:r>
-      <w:r>
-        <w:t xml:space="preserve">and</w:t>
-      </w:r>
-      <w:r>
-        <w:t xml:space="preserve"> </w:t>
-      </w:r>
-      <w:hyperlink r:id="rId93">
-        <w:r>
-          <w:rPr>
-            <w:rStyle w:val="Hyperlink"/>
-          </w:rPr>
-          <w:t xml:space="preserve">processing the response</w:t>
-        </w:r>
-      </w:hyperlink>
-      <w:r>
-        <w:t xml:space="preserve">.</w:t>
-      </w:r>
-    </w:p>
-    <w:p>
-      <w:pPr>
-        <w:numPr>
-          <w:ilvl w:val="1"/>
-          <w:numId w:val="1043"/>
-        </w:numPr>
-      </w:pPr>
-      <w:r>
-        <w:t xml:space="preserve">Using OpenAI API requests an API key. You can generate a key associated with your account</w:t>
       </w:r>
       <w:r>
         <w:t xml:space="preserve"> </w:t>
@@ -27410,6 +26540,882 @@
         </w:r>
       </w:hyperlink>
       <w:r>
+        <w:t xml:space="preserve">. For our homework, we use the</w:t>
+      </w:r>
+      <w:r>
+        <w:t xml:space="preserve"> </w:t>
+      </w:r>
+      <w:r>
+        <w:rPr>
+          <w:rStyle w:val="VerbatimChar"/>
+        </w:rPr>
+        <w:t xml:space="preserve">gpt-3.5-turbo-instruct</w:t>
+      </w:r>
+      <w:r>
+        <w:t xml:space="preserve"> </w:t>
+      </w:r>
+      <w:r>
+        <w:t xml:space="preserve">model.</w:t>
+      </w:r>
+    </w:p>
+    <w:p>
+      <w:pPr>
+        <w:numPr>
+          <w:ilvl w:val="1"/>
+          <w:numId w:val="1038"/>
+        </w:numPr>
+      </w:pPr>
+      <w:r>
+        <w:rPr>
+          <w:bCs/>
+          <w:b/>
+        </w:rPr>
+        <w:t xml:space="preserve">Temperature and Top P sampling:</w:t>
+      </w:r>
+      <w:r>
+        <w:t xml:space="preserve"> </w:t>
+      </w:r>
+      <w:r>
+        <w:t xml:space="preserve">control how the model samples tokens from its distribution. Setting Temperature to 0 will cause the model to produce the highest probability output. Setting it closer to 1 will increase its propensity to create more diverse output.</w:t>
+      </w:r>
+    </w:p>
+    <w:p>
+      <w:pPr>
+        <w:numPr>
+          <w:ilvl w:val="1"/>
+          <w:numId w:val="1038"/>
+        </w:numPr>
+      </w:pPr>
+      <w:r>
+        <w:rPr>
+          <w:bCs/>
+          <w:b/>
+        </w:rPr>
+        <w:t xml:space="preserve">Maximum length:</w:t>
+      </w:r>
+      <w:r>
+        <w:t xml:space="preserve"> </w:t>
+      </w:r>
+      <w:r>
+        <w:t xml:space="preserve">what’s the maximum length (in tokens) that the model will output?</w:t>
+      </w:r>
+    </w:p>
+    <w:p>
+      <w:pPr>
+        <w:numPr>
+          <w:ilvl w:val="1"/>
+          <w:numId w:val="1038"/>
+        </w:numPr>
+      </w:pPr>
+      <w:r>
+        <w:rPr>
+          <w:bCs/>
+          <w:b/>
+        </w:rPr>
+        <w:t xml:space="preserve">Stop sequences:</w:t>
+      </w:r>
+      <w:r>
+        <w:t xml:space="preserve"> </w:t>
+      </w:r>
+      <w:r>
+        <w:t xml:space="preserve">you can specify what tokens should cause the model to stop generating. You can use the newline character or any special sequence that you designate.</w:t>
+      </w:r>
+    </w:p>
+    <w:p>
+      <w:pPr>
+        <w:numPr>
+          <w:ilvl w:val="1"/>
+          <w:numId w:val="1038"/>
+        </w:numPr>
+      </w:pPr>
+      <w:r>
+        <w:rPr>
+          <w:bCs/>
+          <w:b/>
+        </w:rPr>
+        <w:t xml:space="preserve">Frequency Penalty and Presence Penalty:</w:t>
+      </w:r>
+      <w:r>
+        <w:t xml:space="preserve"> </w:t>
+      </w:r>
+      <w:r>
+        <w:t xml:space="preserve">two parameters that help to limit how much repetition there is in the model’s output.</w:t>
+      </w:r>
+    </w:p>
+    <w:p>
+      <w:pPr>
+        <w:numPr>
+          <w:ilvl w:val="1"/>
+          <w:numId w:val="1038"/>
+        </w:numPr>
+      </w:pPr>
+      <w:r>
+        <w:rPr>
+          <w:bCs/>
+          <w:b/>
+        </w:rPr>
+        <w:t xml:space="preserve">Best of:</w:t>
+      </w:r>
+      <w:r>
+        <w:t xml:space="preserve"> </w:t>
+      </w:r>
+      <w:r>
+        <w:t xml:space="preserve">Best of</w:t>
+      </w:r>
+      <w:r>
+        <w:t xml:space="preserve"> </w:t>
+      </w:r>
+      <m:oMath>
+        <m:r>
+          <m:t>n</m:t>
+        </m:r>
+      </m:oMath>
+      <w:r>
+        <w:t xml:space="preserve"> </w:t>
+      </w:r>
+      <w:r>
+        <w:t xml:space="preserve">indicates the model generate</w:t>
+      </w:r>
+      <w:r>
+        <w:t xml:space="preserve"> </w:t>
+      </w:r>
+      <m:oMath>
+        <m:r>
+          <m:t>n</m:t>
+        </m:r>
+      </m:oMath>
+      <w:r>
+        <w:t xml:space="preserve"> </w:t>
+      </w:r>
+      <w:r>
+        <w:t xml:space="preserve">completion candidates on the server side, and display the top-1 on the client (user) side.</w:t>
+      </w:r>
+    </w:p>
+    <w:p>
+      <w:pPr>
+        <w:numPr>
+          <w:ilvl w:val="0"/>
+          <w:numId w:val="1039"/>
+        </w:numPr>
+      </w:pPr>
+      <w:r>
+        <w:t xml:space="preserve">For the remaining parts of this section, set the engine to</w:t>
+      </w:r>
+      <w:r>
+        <w:t xml:space="preserve"> </w:t>
+      </w:r>
+      <w:r>
+        <w:rPr>
+          <w:rStyle w:val="VerbatimChar"/>
+        </w:rPr>
+        <w:t xml:space="preserve">davinci</w:t>
+      </w:r>
+      <w:r>
+        <w:t xml:space="preserve"> </w:t>
+      </w:r>
+      <w:r>
+        <w:t xml:space="preserve">so that it uses vanilla language model (no additional tuning with human feedback).</w:t>
+      </w:r>
+      <w:r>
+        <w:br/>
+      </w:r>
+      <w:r>
+        <w:rPr>
+          <w:bCs/>
+          <w:b/>
+        </w:rPr>
+        <w:t xml:space="preserve">In-context learning:</w:t>
+      </w:r>
+      <w:r>
+        <w:t xml:space="preserve"> </w:t>
+      </w:r>
+      <w:r>
+        <w:t xml:space="preserve">In addition to writing awesome reviews of your professors, you can design prompts to get GPT-3 to do all sorts of surprising things. For instance, GPT-3 can perform few-shot learning. Given a few examples of a task, it can learn a pattern very quickly and then be used for classification tasks. It often helps to tell the model what you want it to do.</w:t>
+      </w:r>
+    </w:p>
+    <w:p>
+      <w:pPr>
+        <w:numPr>
+          <w:ilvl w:val="0"/>
+          <w:numId w:val="1000"/>
+        </w:numPr>
+      </w:pPr>
+      <w:r>
+        <w:t xml:space="preserve">Here’s an example from the paper that introduced GPT-3. It shows a few-show learning example for correcting grammatically incorrect English sentences.</w:t>
+      </w:r>
+    </w:p>
+    <w:p>
+      <w:pPr>
+        <w:numPr>
+          <w:ilvl w:val="0"/>
+          <w:numId w:val="1000"/>
+        </w:numPr>
+        <w:pStyle w:val="SourceCode"/>
+      </w:pPr>
+      <w:r>
+        <w:rPr>
+          <w:rStyle w:val="VerbatimChar"/>
+        </w:rPr>
+        <w:t xml:space="preserve">Poor English input:  I eated the purple berries.</w:t>
+      </w:r>
+      <w:r>
+        <w:br/>
+      </w:r>
+      <w:r>
+        <w:rPr>
+          <w:rStyle w:val="VerbatimChar"/>
+        </w:rPr>
+        <w:t xml:space="preserve">Good English output:  I ate the purple berries.</w:t>
+      </w:r>
+      <w:r>
+        <w:br/>
+      </w:r>
+      <w:r>
+        <w:br/>
+      </w:r>
+      <w:r>
+        <w:rPr>
+          <w:rStyle w:val="VerbatimChar"/>
+        </w:rPr>
+        <w:t xml:space="preserve">Poor English input:  Thank you for picking me as your designer.  I'd appreciate it.</w:t>
+      </w:r>
+      <w:r>
+        <w:br/>
+      </w:r>
+      <w:r>
+        <w:rPr>
+          <w:rStyle w:val="VerbatimChar"/>
+        </w:rPr>
+        <w:t xml:space="preserve">Good English output:  Thank you for choosing me as your designer.  I appreciate it.</w:t>
+      </w:r>
+      <w:r>
+        <w:br/>
+      </w:r>
+      <w:r>
+        <w:br/>
+      </w:r>
+      <w:r>
+        <w:rPr>
+          <w:rStyle w:val="VerbatimChar"/>
+        </w:rPr>
+        <w:t xml:space="preserve">Poor English input:  The mentioned changes have done.  or I did the alteration that you requested.  or I changed things you wanted and did the modifications.</w:t>
+      </w:r>
+      <w:r>
+        <w:br/>
+      </w:r>
+      <w:r>
+        <w:rPr>
+          <w:rStyle w:val="VerbatimChar"/>
+        </w:rPr>
+        <w:t xml:space="preserve">Good English output:  The requested changes have been made.  or I made the alteration that you requested.  or I changed things you wanted and made the modifications.</w:t>
+      </w:r>
+      <w:r>
+        <w:br/>
+      </w:r>
+      <w:r>
+        <w:br/>
+      </w:r>
+      <w:r>
+        <w:rPr>
+          <w:rStyle w:val="VerbatimChar"/>
+        </w:rPr>
+        <w:t xml:space="preserve">Poor English input:  I'd be more than happy to work with you in another project.</w:t>
+      </w:r>
+    </w:p>
+    <w:p>
+      <w:pPr>
+        <w:numPr>
+          <w:ilvl w:val="0"/>
+          <w:numId w:val="1000"/>
+        </w:numPr>
+      </w:pPr>
+      <w:r>
+        <w:rPr>
+          <w:bCs/>
+          <w:b/>
+        </w:rPr>
+        <w:t xml:space="preserve">TODOs</w:t>
+      </w:r>
+      <w:r>
+        <w:t xml:space="preserve">: Paste this prompt into the playground, press the</w:t>
+      </w:r>
+      <w:r>
+        <w:t xml:space="preserve"> </w:t>
+      </w:r>
+      <w:r>
+        <w:t xml:space="preserve">“</w:t>
+      </w:r>
+      <w:r>
+        <w:t xml:space="preserve">Generate</w:t>
+      </w:r>
+      <w:r>
+        <w:t xml:space="preserve">”</w:t>
+      </w:r>
+      <w:r>
+        <w:t xml:space="preserve"> </w:t>
+      </w:r>
+      <w:r>
+        <w:t xml:space="preserve">button, and see what it says. Paste the completion below:</w:t>
+      </w:r>
+    </w:p>
+    <w:p>
+      <w:pPr>
+        <w:pStyle w:val="AnswerText"/>
+      </w:pPr>
+      <w:r>
+        <w:t xml:space="preserve">The base model, Qwen2.5-1.5B, standing in for</w:t>
+      </w:r>
+      <w:r>
+        <w:t xml:space="preserve"> </w:t>
+      </w:r>
+      <w:r>
+        <w:rPr>
+          <w:rStyle w:val="VerbatimChar"/>
+        </w:rPr>
+        <w:t xml:space="preserve">davinci</w:t>
+      </w:r>
+      <w:r>
+        <w:t xml:space="preserve">, completed it like this (greedy, up to 40 new tokens, with a stop at a blank line):</w:t>
+      </w:r>
+    </w:p>
+    <w:p>
+      <w:pPr>
+        <w:pStyle w:val="SourceCode"/>
+      </w:pPr>
+      <w:r>
+        <w:rPr>
+          <w:rStyle w:val="VerbatimChar"/>
+        </w:rPr>
+        <w:t xml:space="preserve">Good English output:  I would be more than happy to work with you in another project.</w:t>
+      </w:r>
+    </w:p>
+    <w:p>
+      <w:pPr>
+        <w:pStyle w:val="AnswerText"/>
+      </w:pPr>
+      <w:r>
+        <w:t xml:space="preserve">It picked up the format from the three examples, including the label and the two spaces after the colon, and it stopped at the blank line where the next example would start. But the fix misses the actual error. It expanded</w:t>
+      </w:r>
+      <w:r>
+        <w:t xml:space="preserve"> </w:t>
+      </w:r>
+      <w:r>
+        <w:t xml:space="preserve">“</w:t>
+      </w:r>
+      <w:r>
+        <w:t xml:space="preserve">I’d</w:t>
+      </w:r>
+      <w:r>
+        <w:t xml:space="preserve">”</w:t>
+      </w:r>
+      <w:r>
+        <w:t xml:space="preserve"> </w:t>
+      </w:r>
+      <w:r>
+        <w:t xml:space="preserve">to</w:t>
+      </w:r>
+      <w:r>
+        <w:t xml:space="preserve"> </w:t>
+      </w:r>
+      <w:r>
+        <w:t xml:space="preserve">“</w:t>
+      </w:r>
+      <w:r>
+        <w:t xml:space="preserve">I would</w:t>
+      </w:r>
+      <w:r>
+        <w:t xml:space="preserve">”</w:t>
+      </w:r>
+      <w:r>
+        <w:t xml:space="preserve"> </w:t>
+      </w:r>
+      <w:r>
+        <w:t xml:space="preserve">and kept</w:t>
+      </w:r>
+      <w:r>
+        <w:t xml:space="preserve"> </w:t>
+      </w:r>
+      <w:r>
+        <w:t xml:space="preserve">“</w:t>
+      </w:r>
+      <w:r>
+        <w:t xml:space="preserve">in another project,</w:t>
+      </w:r>
+      <w:r>
+        <w:t xml:space="preserve">”</w:t>
+      </w:r>
+      <w:r>
+        <w:t xml:space="preserve"> </w:t>
+      </w:r>
+      <w:r>
+        <w:t xml:space="preserve">where the preposition should be</w:t>
+      </w:r>
+      <w:r>
+        <w:t xml:space="preserve"> </w:t>
+      </w:r>
+      <w:r>
+        <w:t xml:space="preserve">“</w:t>
+      </w:r>
+      <w:r>
+        <w:t xml:space="preserve">on.</w:t>
+      </w:r>
+      <w:r>
+        <w:t xml:space="preserve">”</w:t>
+      </w:r>
+      <w:r>
+        <w:t xml:space="preserve"> </w:t>
+      </w:r>
+      <w:r>
+        <w:t xml:space="preserve">The Instruct model, given the same raw prompt, made the real fix:</w:t>
+      </w:r>
+      <w:r>
+        <w:t xml:space="preserve"> </w:t>
+      </w:r>
+      <w:r>
+        <w:t xml:space="preserve">“</w:t>
+      </w:r>
+      <w:r>
+        <w:t xml:space="preserve">I would be more than happy to work with you on another project.</w:t>
+      </w:r>
+      <w:r>
+        <w:t xml:space="preserve">”</w:t>
+      </w:r>
+      <w:r>
+        <w:t xml:space="preserve"> </w:t>
+      </w:r>
+      <w:r>
+        <w:t xml:space="preserve">So did the Instruct model as a chat turn. Three examples were enough for the base model to learn the shape of the task. Getting the correction itself right is where the instruction tuning showed.</w:t>
+      </w:r>
+    </w:p>
+    <w:p>
+      <w:pPr>
+        <w:numPr>
+          <w:ilvl w:val="0"/>
+          <w:numId w:val="1040"/>
+        </w:numPr>
+        <w:pStyle w:val="Compact"/>
+      </w:pPr>
+      <w:r>
+        <w:rPr>
+          <w:bCs/>
+          <w:b/>
+        </w:rPr>
+        <w:t xml:space="preserve">Instruction following:</w:t>
+      </w:r>
+      <w:r>
+        <w:t xml:space="preserve"> </w:t>
+      </w:r>
+      <w:r>
+        <w:t xml:space="preserve">In addition to few shot learning, GPT and other large language models do a pretty remarkable job in</w:t>
+      </w:r>
+      <w:r>
+        <w:t xml:space="preserve"> </w:t>
+      </w:r>
+      <w:r>
+        <w:t xml:space="preserve">“</w:t>
+      </w:r>
+      <w:r>
+        <w:t xml:space="preserve">zero-shot</w:t>
+      </w:r>
+      <w:r>
+        <w:t xml:space="preserve">”</w:t>
+      </w:r>
+      <w:r>
+        <w:t xml:space="preserve"> </w:t>
+      </w:r>
+      <w:r>
+        <w:t xml:space="preserve">scenarios. You can give them instructions in natural language and they may produce remarkably good output.</w:t>
+      </w:r>
+    </w:p>
+    <w:p>
+      <w:pPr>
+        <w:numPr>
+          <w:ilvl w:val="0"/>
+          <w:numId w:val="1041"/>
+        </w:numPr>
+      </w:pPr>
+      <w:r>
+        <w:t xml:space="preserve">For example, let’s try the following prompt:</w:t>
+      </w:r>
+    </w:p>
+    <w:p>
+      <w:pPr>
+        <w:numPr>
+          <w:ilvl w:val="0"/>
+          <w:numId w:val="1000"/>
+        </w:numPr>
+        <w:pStyle w:val="SourceCode"/>
+      </w:pPr>
+      <w:r>
+        <w:rPr>
+          <w:rStyle w:val="VerbatimChar"/>
+        </w:rPr>
+        <w:t xml:space="preserve">Correct this English text:  Today I have went to the store to to buys some many bottle of water.</w:t>
+      </w:r>
+    </w:p>
+    <w:p>
+      <w:pPr>
+        <w:numPr>
+          <w:ilvl w:val="0"/>
+          <w:numId w:val="1000"/>
+        </w:numPr>
+      </w:pPr>
+      <w:r>
+        <w:rPr>
+          <w:bCs/>
+          <w:b/>
+        </w:rPr>
+        <w:t xml:space="preserve">TODOs</w:t>
+      </w:r>
+      <w:r>
+        <w:t xml:space="preserve">: Paste this prompt into the playground, press the</w:t>
+      </w:r>
+      <w:r>
+        <w:t xml:space="preserve"> </w:t>
+      </w:r>
+      <w:r>
+        <w:t xml:space="preserve">“</w:t>
+      </w:r>
+      <w:r>
+        <w:t xml:space="preserve">Generate</w:t>
+      </w:r>
+      <w:r>
+        <w:t xml:space="preserve">”</w:t>
+      </w:r>
+      <w:r>
+        <w:t xml:space="preserve"> </w:t>
+      </w:r>
+      <w:r>
+        <w:t xml:space="preserve">button, and see what it says. Paste the completion below:</w:t>
+      </w:r>
+    </w:p>
+    <w:p>
+      <w:pPr>
+        <w:pStyle w:val="AnswerText"/>
+      </w:pPr>
+      <w:r>
+        <w:t xml:space="preserve">The base model, Qwen2.5-1.5B, completed it like this (greedy, up to 60 new tokens, the prompt and then the completion):</w:t>
+      </w:r>
+    </w:p>
+    <w:p>
+      <w:pPr>
+        <w:pStyle w:val="SourceCode"/>
+      </w:pPr>
+      <w:r>
+        <w:rPr>
+          <w:rStyle w:val="VerbatimChar"/>
+        </w:rPr>
+        <w:t xml:space="preserve">Correct this English text:  Today I have went to the store to to buys some many bottle of water. I have bought 10 bottles of water and 5 bottles of juice. I have paid 10 dollars for the water and 5 dollars for the juice. I have got 15 dollars back from the store. I have went to the store to buy some many bottle of water.</w:t>
+      </w:r>
+    </w:p>
+    <w:p>
+      <w:pPr>
+        <w:pStyle w:val="AnswerText"/>
+      </w:pPr>
+      <w:r>
+        <w:t xml:space="preserve">It didn’t correct anything. It treated the instruction as the first line of a story and kept writing about bottles of water, and its last sentence repeats the original errors. A base model is only trained to predict the next token, and nothing in that training marks</w:t>
+      </w:r>
+      <w:r>
+        <w:t xml:space="preserve"> </w:t>
+      </w:r>
+      <w:r>
+        <w:t xml:space="preserve">“</w:t>
+      </w:r>
+      <w:r>
+        <w:t xml:space="preserve">Correct this English text:</w:t>
+      </w:r>
+      <w:r>
+        <w:t xml:space="preserve">”</w:t>
+      </w:r>
+      <w:r>
+        <w:t xml:space="preserve"> </w:t>
+      </w:r>
+      <w:r>
+        <w:t xml:space="preserve">as a command.</w:t>
+      </w:r>
+    </w:p>
+    <w:p>
+      <w:pPr>
+        <w:pStyle w:val="AnswerText"/>
+      </w:pPr>
+      <w:r>
+        <w:t xml:space="preserve">The Instruct model did no better as raw text. It continued the story too:</w:t>
+      </w:r>
+      <w:r>
+        <w:t xml:space="preserve"> </w:t>
+      </w:r>
+      <w:r>
+        <w:t xml:space="preserve">“</w:t>
+      </w:r>
+      <w:r>
+        <w:t xml:space="preserve">The price was very high, so I decided not to buy any.</w:t>
+      </w:r>
+      <w:r>
+        <w:t xml:space="preserve">”</w:t>
+      </w:r>
+      <w:r>
+        <w:t xml:space="preserve"> </w:t>
+      </w:r>
+      <w:r>
+        <w:t xml:space="preserve">Its instruction tuning only kicked in when the prompt came as a chat turn, through its chat template. Then it answered</w:t>
+      </w:r>
+      <w:r>
+        <w:t xml:space="preserve"> </w:t>
+      </w:r>
+      <w:r>
+        <w:t xml:space="preserve">“</w:t>
+      </w:r>
+      <w:r>
+        <w:t xml:space="preserve">Today, I went to the store to buy several bottles of water.</w:t>
+      </w:r>
+      <w:r>
+        <w:t xml:space="preserve">”</w:t>
+      </w:r>
+      <w:r>
+        <w:t xml:space="preserve"> </w:t>
+      </w:r>
+      <w:r>
+        <w:t xml:space="preserve">That fixes every error and keeps the meaning, though</w:t>
+      </w:r>
+      <w:r>
+        <w:t xml:space="preserve"> </w:t>
+      </w:r>
+      <w:r>
+        <w:t xml:space="preserve">“</w:t>
+      </w:r>
+      <w:r>
+        <w:t xml:space="preserve">several</w:t>
+      </w:r>
+      <w:r>
+        <w:t xml:space="preserve">”</w:t>
+      </w:r>
+      <w:r>
+        <w:t xml:space="preserve"> </w:t>
+      </w:r>
+      <w:r>
+        <w:t xml:space="preserve">is its guess at what</w:t>
+      </w:r>
+      <w:r>
+        <w:t xml:space="preserve"> </w:t>
+      </w:r>
+      <w:r>
+        <w:t xml:space="preserve">“</w:t>
+      </w:r>
+      <w:r>
+        <w:t xml:space="preserve">some many</w:t>
+      </w:r>
+      <w:r>
+        <w:t xml:space="preserve">”</w:t>
+      </w:r>
+      <w:r>
+        <w:t xml:space="preserve"> </w:t>
+      </w:r>
+      <w:r>
+        <w:t xml:space="preserve">meant. So the model can follow the instruction, but only in the format it was tuned on.</w:t>
+      </w:r>
+    </w:p>
+    <w:p>
+      <w:pPr>
+        <w:numPr>
+          <w:ilvl w:val="0"/>
+          <w:numId w:val="1042"/>
+        </w:numPr>
+      </w:pPr>
+      <w:r>
+        <w:rPr>
+          <w:bCs/>
+          <w:b/>
+        </w:rPr>
+        <w:t xml:space="preserve">Programmatic access:</w:t>
+      </w:r>
+      <w:r>
+        <w:t xml:space="preserve"> </w:t>
+      </w:r>
+      <w:r>
+        <w:t xml:space="preserve">In addition to prompting GPT models in the playground, you can write Python code to query models with provided OpenAI APIs. Now let’s use few-shot prompting to solve a few instance of BoolQ.</w:t>
+      </w:r>
+      <w:r>
+        <w:br/>
+      </w:r>
+      <w:r>
+        <w:rPr>
+          <w:bCs/>
+          <w:b/>
+        </w:rPr>
+        <w:t xml:space="preserve">TODOs</w:t>
+      </w:r>
+      <w:r>
+        <w:t xml:space="preserve">: Write a Python script for few-shot prompting OpenAI GPT models on BoolQ. Specifically, form a prompt by randomly selecting 8 demonstrations from BoolQ. Make sure to have a balanced prompt (50% ’yes’s and the rest ’no’s) and interleave them to prevent the recency and label-imbalance biases. Using this in-context demonstration, evaluate</w:t>
+      </w:r>
+      <w:r>
+        <w:t xml:space="preserve"> </w:t>
+      </w:r>
+      <w:r>
+        <w:rPr>
+          <w:rStyle w:val="VerbatimChar"/>
+        </w:rPr>
+        <w:t xml:space="preserve">gpt-3.5-turbo-instruct</w:t>
+      </w:r>
+      <w:r>
+        <w:t xml:space="preserve"> </w:t>
+      </w:r>
+      <w:r>
+        <w:t xml:space="preserve">on a small subset of BoolQ instances (say, 30 examples). Hand in your code used to perform this evaluation, it should be named as</w:t>
+      </w:r>
+      <w:r>
+        <w:t xml:space="preserve"> </w:t>
+      </w:r>
+      <w:r>
+        <w:rPr>
+          <w:rStyle w:val="VerbatimChar"/>
+        </w:rPr>
+        <w:t xml:space="preserve">openai_gpt-boolq.py</w:t>
+      </w:r>
+      <w:r>
+        <w:t xml:space="preserve">. Write down the evaluation accuracy below.</w:t>
+      </w:r>
+      <w:r>
+        <w:br/>
+      </w:r>
+      <w:r>
+        <w:rPr>
+          <w:bCs/>
+          <w:b/>
+        </w:rPr>
+        <w:t xml:space="preserve">Hints</w:t>
+      </w:r>
+      <w:r>
+        <w:t xml:space="preserve">:</w:t>
+      </w:r>
+    </w:p>
+    <w:p>
+      <w:pPr>
+        <w:numPr>
+          <w:ilvl w:val="1"/>
+          <w:numId w:val="1043"/>
+        </w:numPr>
+      </w:pPr>
+      <w:r>
+        <w:t xml:space="preserve">We use the</w:t>
+      </w:r>
+      <w:r>
+        <w:t xml:space="preserve"> </w:t>
+      </w:r>
+      <w:r>
+        <w:rPr>
+          <w:rStyle w:val="VerbatimChar"/>
+        </w:rPr>
+        <w:t xml:space="preserve">gpt-3.5-turbo-instruct</w:t>
+      </w:r>
+      <w:r>
+        <w:t xml:space="preserve"> </w:t>
+      </w:r>
+      <w:r>
+        <w:t xml:space="preserve">model (</w:t>
+      </w:r>
+      <w:r>
+        <w:rPr>
+          <w:rStyle w:val="VerbatimChar"/>
+        </w:rPr>
+        <w:t xml:space="preserve">model="gpt-3.5-turbo-instruct"</w:t>
+      </w:r>
+      <w:r>
+        <w:t xml:space="preserve">)</w:t>
+      </w:r>
+    </w:p>
+    <w:p>
+      <w:pPr>
+        <w:numPr>
+          <w:ilvl w:val="1"/>
+          <w:numId w:val="1043"/>
+        </w:numPr>
+      </w:pPr>
+      <w:r>
+        <w:t xml:space="preserve">You can use the playground to create a skeleton code to start with based on a prompt that you can then use in your Python projects. Click on the</w:t>
+      </w:r>
+      <w:r>
+        <w:t xml:space="preserve"> </w:t>
+      </w:r>
+      <w:r>
+        <w:t xml:space="preserve">“</w:t>
+      </w:r>
+      <w:r>
+        <w:t xml:space="preserve">View Code</w:t>
+      </w:r>
+      <w:r>
+        <w:t xml:space="preserve">”</w:t>
+      </w:r>
+      <w:r>
+        <w:t xml:space="preserve"> </w:t>
+      </w:r>
+      <w:r>
+        <w:t xml:space="preserve">button on the top-right, and you’ll get some code that you can convert into a script.</w:t>
+      </w:r>
+    </w:p>
+    <w:p>
+      <w:pPr>
+        <w:numPr>
+          <w:ilvl w:val="1"/>
+          <w:numId w:val="1043"/>
+        </w:numPr>
+      </w:pPr>
+      <w:r>
+        <w:t xml:space="preserve">You can also refer to the full documentation for</w:t>
+      </w:r>
+      <w:r>
+        <w:t xml:space="preserve"> </w:t>
+      </w:r>
+      <w:hyperlink r:id="rId95">
+        <w:r>
+          <w:rPr>
+            <w:rStyle w:val="Hyperlink"/>
+          </w:rPr>
+          <w:t xml:space="preserve">creating completion</w:t>
+        </w:r>
+      </w:hyperlink>
+      <w:r>
+        <w:t xml:space="preserve"> </w:t>
+      </w:r>
+      <w:r>
+        <w:t xml:space="preserve">and</w:t>
+      </w:r>
+      <w:r>
+        <w:t xml:space="preserve"> </w:t>
+      </w:r>
+      <w:hyperlink r:id="rId96">
+        <w:r>
+          <w:rPr>
+            <w:rStyle w:val="Hyperlink"/>
+          </w:rPr>
+          <w:t xml:space="preserve">processing the response</w:t>
+        </w:r>
+      </w:hyperlink>
+      <w:r>
+        <w:t xml:space="preserve">.</w:t>
+      </w:r>
+    </w:p>
+    <w:p>
+      <w:pPr>
+        <w:numPr>
+          <w:ilvl w:val="1"/>
+          <w:numId w:val="1043"/>
+        </w:numPr>
+      </w:pPr>
+      <w:r>
+        <w:t xml:space="preserve">Using OpenAI API requests an API key. You can generate a key associated with your account</w:t>
+      </w:r>
+      <w:r>
+        <w:t xml:space="preserve"> </w:t>
+      </w:r>
+      <w:hyperlink r:id="rId97">
+        <w:r>
+          <w:rPr>
+            <w:rStyle w:val="Hyperlink"/>
+          </w:rPr>
+          <w:t xml:space="preserve">here</w:t>
+        </w:r>
+      </w:hyperlink>
+      <w:r>
         <w:t xml:space="preserve">. To input the key, you can either do</w:t>
       </w:r>
       <w:r>
@@ -27430,7 +27436,7 @@
       <w:r>
         <w:t xml:space="preserve"> </w:t>
       </w:r>
-      <w:hyperlink r:id="rId95">
+      <w:hyperlink r:id="rId98">
         <w:r>
           <w:rPr>
             <w:rStyle w:val="Hyperlink"/>
@@ -27810,9 +27816,9 @@
         <w:t xml:space="preserve">The 0.778 is the number that surprised me. With no training at all, eight examples in the prompt get a 1.5-billion-parameter model to within a point of full fine-tuning RoBERTa-base in 3.2.1 (0.786 on the same 3,270 questions) and ahead of LoRA (0.762). It isn’t a fair fight in either direction. The Qwen model is twelve times larger than RoBERTa-base and was pretrained on far more text, and its instruction tuning may have included question answering much like BoolQ. I can’t rule out that BoolQ itself was in its training data. On the other side, the fine-tuned models saw 8,000 labeled examples, and the prompt has 8.</w:t>
       </w:r>
     </w:p>
-    <w:bookmarkEnd w:id="96"/>
-    <w:bookmarkEnd w:id="97"/>
-    <w:bookmarkEnd w:id="98"/>
+    <w:bookmarkEnd w:id="99"/>
+    <w:bookmarkEnd w:id="100"/>
+    <w:bookmarkEnd w:id="101"/>
     <w:sectPr>
       <w:footnotePr>
         <w:numRestart w:val="eachSect"/>

</xml_diff>

<commit_message>
Fix factual slips from review, add 3.3.4 demo-order note, drop duplicate PDF
3.2.1: the RoBERTa pooler gets no gradient under mean pooling, so 124,056,578
parameters train, not 124,647,170. Two per-epoch rounding fixes (3.2.1, 3.2.2).
3.2.4: held memory is weights plus AdamW state (gradients are freed), and
frozen linear layers don't save their inputs. 2.1.2: query/key matches can still
drift through other paths. Only Onieal_HW6.pdf at the repo root now.

Co-Authored-By: Claude Opus 5.5 <noreply@anthropic.com>
Claude-Session: https://claude.ai/code/session_015HDBYwejW7XLvPNhSrJNtf
</commit_message>
<xml_diff>
--- a/Onieal_HW6.docx
+++ b/Onieal_HW6.docx
@@ -7642,7 +7642,7 @@
         <w:pStyle w:val="AnswerText"/>
       </w:pPr>
       <w:r>
-        <w:t xml:space="preserve">In practice this means whatever key a query happens to match at initialization is the key it keeps matching. The model can still learn what to say (the values), but not where to look. It also can’t blend information from several positions, since every output is a copy of a single value.</w:t>
+        <w:t xml:space="preserve">Which key a query matches can still change during training, because the layer’s inputs change as earlier layers learn through the value and residual paths. But no gradient ever pushes a query or key toward a better match. The model can still learn what to say (the values), but not where to look. It also can’t blend information from several positions, since every output is a copy of a single value.</w:t>
       </w:r>
     </w:p>
     <w:bookmarkEnd w:id="21"/>
@@ -22616,7 +22616,7 @@
         <w:pStyle w:val="AnswerText"/>
       </w:pPr>
       <w:r>
-        <w:t xml:space="preserve">Answer: dev accuracy 0.7856 and test accuracy 0.7730, with learning rate 2e-5, 6 epochs, and batch 32 (17 minutes on my GPU). I chose 2e-5 because it’s in the 1e-5 to 3e-5 range the RoBERTa paper used for fine-tuning (Liu et al., 2019), and the 3.1.3 grid had already shown that 5e-4 and up collapses to always-yes. Dev accuracy after each epoch was 0.714, 0.769, 0.743, 0.777, 0.780, and 0.786, and training accuracy reached 0.964 in the last epoch.</w:t>
+        <w:t xml:space="preserve">Answer: dev accuracy 0.7856 and test accuracy 0.7730, with learning rate 2e-5, 6 epochs, and batch 32 (17 minutes on my GPU). I chose 2e-5 because it’s in the 1e-5 to 3e-5 range the RoBERTa paper used for fine-tuning (Liu et al., 2019), and the 3.1.3 grid had already shown that 5e-4 and up collapses to always-yes. Dev accuracy after each epoch was 0.714, 0.769, 0.743, 0.776, 0.780, and 0.786, and training accuracy reached 0.964 in the last epoch.</w:t>
       </w:r>
     </w:p>
     <w:p>
@@ -22674,7 +22674,46 @@
         <w:t xml:space="preserve"> </w:t>
       </w:r>
       <w:r>
-        <w:t xml:space="preserve">creates but full mode never uses, so it gets no gradient and AdamW never changes it. The parameters that actually train are RoBERTa-base’s 124,645,632 plus the 1,538 in the head, 124,647,170 in total.</w:t>
+        <w:t xml:space="preserve">creates but full mode never uses, so it gets no gradient and AdamW never changes it. RoBERTa’s pooler is in the same position.</w:t>
+      </w:r>
+      <w:r>
+        <w:t xml:space="preserve"> </w:t>
+      </w:r>
+      <w:r>
+        <w:rPr>
+          <w:rStyle w:val="VerbatimChar"/>
+        </w:rPr>
+        <w:t xml:space="preserve">AutoModel</w:t>
+      </w:r>
+      <w:r>
+        <w:t xml:space="preserve"> </w:t>
+      </w:r>
+      <w:r>
+        <w:t xml:space="preserve">loads RoBERTa with it, a 768 × 768 layer plus bias (590,592 numbers) that only feeds the</w:t>
+      </w:r>
+      <w:r>
+        <w:t xml:space="preserve"> </w:t>
+      </w:r>
+      <w:r>
+        <w:rPr>
+          <w:rStyle w:val="VerbatimChar"/>
+        </w:rPr>
+        <w:t xml:space="preserve">[CLS]</w:t>
+      </w:r>
+      <w:r>
+        <w:t xml:space="preserve">-based</w:t>
+      </w:r>
+      <w:r>
+        <w:t xml:space="preserve"> </w:t>
+      </w:r>
+      <w:r>
+        <w:rPr>
+          <w:rStyle w:val="VerbatimChar"/>
+        </w:rPr>
+        <w:t xml:space="preserve">pooler_output</w:t>
+      </w:r>
+      <w:r>
+        <w:t xml:space="preserve">, and the mean-pooled head never uses that output. So the parameters that actually train are RoBERTa-base’s 124,645,632 minus the pooler’s 590,592, plus the 1,538 in the head, 124,056,578 in total.</w:t>
       </w:r>
     </w:p>
     <w:p>
@@ -23226,7 +23265,7 @@
         <w:pStyle w:val="AnswerText"/>
       </w:pPr>
       <w:r>
-        <w:t xml:space="preserve">Answer: dev accuracy 0.6425 and test accuracy 0.6391, with learning rate 1e-3, 10 epochs, and batch 32. Following the footnote, I used a 50 times larger learning rate and more epochs than full fine-tuning. Only 1,538 parameters train. Dev accuracy crept from 0.625 after epoch 1 to 0.643 after epoch 9, and training accuracy only reached 0.658. That’s 2 points above always-yes on dev (0.622) and 14 points below full fine-tuning.</w:t>
+        <w:t xml:space="preserve">Answer: dev accuracy 0.6425 and test accuracy 0.6391, with learning rate 1e-3, 10 epochs, and batch 32. Following the footnote, I used a 50 times larger learning rate and more epochs than full fine-tuning. Only 1,538 parameters train. Dev accuracy crept from 0.624 after epoch 1 to 0.643 after epoch 9, and training accuracy only reached 0.658. That’s 2 points above always-yes on dev (0.622) and 14 points below full fine-tuning.</w:t>
       </w:r>
     </w:p>
     <w:p>
@@ -24557,7 +24596,7 @@
               <w:jc w:val="left"/>
             </w:pPr>
             <w:r>
-              <w:t xml:space="preserve">Held between steps: weights, gradients, AdamW state (MiB)</w:t>
+              <w:t xml:space="preserve">Held between steps: weights and AdamW state (MiB)</w:t>
             </w:r>
           </w:p>
         </w:tc>
@@ -24604,7 +24643,22 @@
         <w:pStyle w:val="AnswerText"/>
       </w:pPr>
       <w:r>
-        <w:t xml:space="preserve">Full fine-tuning saves 3,045 MiB of activations in the forward pass, because every layer’s weights need a gradient, and each of those gradients needs that layer’s inputs. The backward pass frees those activations and allocates gradients for all 124.6 million weights (about 475 MiB at 4 bytes each), so it nets out at 3,045 - 475 = 2,570 MiB freed, close to the 2,544 recorded. Its fixed cost is also the largest, 1,484 MiB, because AdamW keeps two extra numbers for every weight.</w:t>
+        <w:t xml:space="preserve">Full fine-tuning saves 3,045 MiB of activations in the forward pass, because every layer’s weights need a gradient, and each of those gradients needs that layer’s inputs. The backward pass frees those activations and allocates gradients for the 124.06 million weights that train (about 473 MiB at 4 bytes each), so it nets out at 3,045 - 473 = 2,572 MiB freed, close to the 2,544 recorded. Its fixed cost is also the largest, 1,484 MiB, because AdamW keeps two extra numbers for every weight that trains. That’s about 476 MiB of weights plus about 947 MiB of AdamW state, and I didn’t track down the last 60 MiB or so. Gradients aren’t part of it, because</w:t>
+      </w:r>
+      <w:r>
+        <w:t xml:space="preserve"> </w:t>
+      </w:r>
+      <w:r>
+        <w:rPr>
+          <w:rStyle w:val="VerbatimChar"/>
+        </w:rPr>
+        <w:t xml:space="preserve">zero_grad(set_to_none=True)</w:t>
+      </w:r>
+      <w:r>
+        <w:t xml:space="preserve"> </w:t>
+      </w:r>
+      <w:r>
+        <w:t xml:space="preserve">frees them at the end of each step.</w:t>
       </w:r>
     </w:p>
     <w:p>
@@ -24620,7 +24674,7 @@
         <w:pStyle w:val="AnswerText"/>
       </w:pPr>
       <w:r>
-        <w:t xml:space="preserve">Prefix-tuning was the surprise. It trains about 100,000 parameters, so its fixed cost matches head-tuning, but its forward pass saves 5,360 MiB, 76% more than full fine-tuning. The gradient has to flow back through all 12 frozen layers to reach the prefix, so every layer’s activations have to be kept, the same as in full fine-tuning. On top of that, the prefix doubles the sequence from 128 to 256 positions, which doubles most activations and quadruples the attention score matrices. Its backward pass frees almost exactly what the forward saved, because the only gradients it stores are for the prefix and the head (about 0.4 MiB). Peak use for one step is roughly 1,484 + 3,068 = 4,552 MiB for full fine-tuning and 495 + 5,612 = 6,107 MiB for prefix-tuning. The card has 6,141 MiB in total, and part of that goes to the CUDA context, so prefix-tuning at batch 32 doesn’t fit in float32. I trained it at batch 16 with</w:t>
+        <w:t xml:space="preserve">Prefix-tuning was the surprise. It trains about 100,000 parameters, so its fixed cost matches head-tuning, but its forward pass saves 5,360 MiB, 76% more than full fine-tuning. The gradient has to flow back through all 12 frozen layers to reach the prefix, so most of each layer’s activations still have to be kept. The attention scores, the softmax outputs, and the inputs to GELU and LayerNorm are all needed to pass the gradient back. The inputs to the frozen linear layers aren’t, because a frozen weight needs no gradient. On top of that, the prefix doubles the sequence from 128 to 256 positions, which doubles most activations and quadruples the attention score matrices. Its backward pass frees almost exactly what the forward saved, because the only gradients it stores are for the prefix and the head (about 0.4 MiB). Peak use for one step is roughly 1,484 + 3,068 = 4,552 MiB for full fine-tuning and 495 + 5,612 = 6,107 MiB for prefix-tuning. The card has 6,141 MiB in total, and part of that goes to the CUDA context, so prefix-tuning at batch 32 doesn’t fit in float32. I trained it at batch 16 with</w:t>
       </w:r>
       <w:r>
         <w:t xml:space="preserve"> </w:t>
@@ -27763,7 +27817,7 @@
         <w:t xml:space="preserve">davinci</w:t>
       </w:r>
       <w:r>
-        <w:t xml:space="preserve">. It got 19 of 30 (0.633), no better than always-yes on those questions. On all 3,270 it got 2,439 right, 0.746. It answered yes 1,710 times and no 1,557 times, so it leans toward no, and 3 completions didn’t start with yes or no (</w:t>
+        <w:t xml:space="preserve">. It got 19 of 30 (0.633), no better than always-yes on those questions. On all 3,270 it got 2,439 right, 0.746. It answered yes 1,710 times and no 1,557 times, against 2,033 and 1,237 true, so it leans toward no. One possible reason, which I didn’t test: the demonstrations alternate yes, no, yes, no, so every prompt ends on a no example, and a model that copies the most recent label would drift toward no. The Instruct model doesn’t lean that way. Three base-model completions didn’t start with yes or no (</w:t>
       </w:r>
       <w:r>
         <w:t xml:space="preserve">“</w:t>

</xml_diff>